<commit_message>
v1.1: Apply all review fixes (17 items)
- SHA-512 standardized across all documents
- Version 1.1 in all docs with revision history
- Related Work expanded with competitive landscape analysis
- NIST PQC migration path (ML-DSA / FIPS 204)
- DDA null sentinel padding and boundary overlap specification
- Tier promotion criteria defined (100 consecutive clean actions)
- Signing Authority N+1 redundancy requirement
- 80/15/5 workload split made informative, not normative
- OWASP spec marked as canonical reference
- event-stream incident footnote added
- Crosswalk coverage matrix note
- Cross-reference section disambiguation
- OWASP Overview quick links completed
- EO 14110 acknowledged in cover letter
- Quarantine buffer hostile-by-design explanation
- Policy orchestrator vs workflow orchestrator distinction

Authors: Michael Harrison and Ard Haskell, OSInfo Inc.
</commit_message>
<xml_diff>
--- a/submissions/AITP_NIST_Cover_Letter.docx
+++ b/submissions/AITP_NIST_Cover_Letter.docx
@@ -163,6 +163,12 @@
       </w:r>
     </w:p>
     <w:p/>
+    <w:p>
+      <w:pPr/>
+      <w:r>
+        <w:t>We note that Executive Order 14110 (October 2023) established initial federal AI governance requirements, and that the regulatory landscape continues to evolve. AITP is designed to be complementary to any governance direction: it provides the technical trust infrastructure that enables compliance with process integrity requirements regardless of the specific regulatory framework in effect. The cryptographic attestation chain, bounded blast radius, and defined recovery procedures address the accountability and transparency requirements common to all proposed AI governance approaches.</w:t>
+      </w:r>
+    </w:p>
     <w:p>
       <w:r>
         <w:t>Respectfully,</w:t>

</xml_diff>